<commit_message>
pruning and quantisation done
</commit_message>
<xml_diff>
--- a/first iteration results/results word file.docx
+++ b/first iteration results/results word file.docx
@@ -46,6 +46,1784 @@
         </w:drawing>
       </w:r>
     </w:p>
+    <w:p>
+      <w:r>
+        <w:t>Model results</w:t>
+      </w:r>
+    </w:p>
+    <w:p>
+      <w:r>
+        <w:t>PS C:\Users\Hp\Documents\github_projects_new\Skin_disease_detection&gt; &amp; c:\python314\python.exe c:/Users/Hp/Documents/github_projects_new/Skin_disease_detection/detection_disease_model.py</w:t>
+      </w:r>
+    </w:p>
+    <w:p>
+      <w:r>
+        <w:t xml:space="preserve">Using device: </w:t>
+      </w:r>
+      <w:proofErr w:type="spellStart"/>
+      <w:r>
+        <w:t>cpu</w:t>
+      </w:r>
+      <w:proofErr w:type="spellEnd"/>
+    </w:p>
+    <w:p>
+      <w:proofErr w:type="spellStart"/>
+      <w:proofErr w:type="gramStart"/>
+      <w:r>
+        <w:t>SkinLesionCNN</w:t>
+      </w:r>
+      <w:proofErr w:type="spellEnd"/>
+      <w:r>
+        <w:t>(</w:t>
+      </w:r>
+      <w:proofErr w:type="gramEnd"/>
+    </w:p>
+    <w:p>
+      <w:r>
+        <w:t xml:space="preserve">  (conv1): Conv2</w:t>
+      </w:r>
+      <w:proofErr w:type="gramStart"/>
+      <w:r>
+        <w:t>d(</w:t>
+      </w:r>
+      <w:proofErr w:type="gramEnd"/>
+      <w:r>
+        <w:t xml:space="preserve">3, 16, </w:t>
+      </w:r>
+      <w:proofErr w:type="spellStart"/>
+      <w:r>
+        <w:t>kernel_size</w:t>
+      </w:r>
+      <w:proofErr w:type="spellEnd"/>
+      <w:proofErr w:type="gramStart"/>
+      <w:r>
+        <w:t>=(</w:t>
+      </w:r>
+      <w:proofErr w:type="gramEnd"/>
+      <w:r>
+        <w:t>3, 3), stride</w:t>
+      </w:r>
+      <w:proofErr w:type="gramStart"/>
+      <w:r>
+        <w:t>=(</w:t>
+      </w:r>
+      <w:proofErr w:type="gramEnd"/>
+      <w:r>
+        <w:t>1, 1), padding</w:t>
+      </w:r>
+      <w:proofErr w:type="gramStart"/>
+      <w:r>
+        <w:t>=(</w:t>
+      </w:r>
+      <w:proofErr w:type="gramEnd"/>
+      <w:r>
+        <w:t>1, 1))</w:t>
+      </w:r>
+    </w:p>
+    <w:p>
+      <w:r>
+        <w:t xml:space="preserve">  (bn1): BatchNorm2</w:t>
+      </w:r>
+      <w:proofErr w:type="gramStart"/>
+      <w:r>
+        <w:t>d(</w:t>
+      </w:r>
+      <w:proofErr w:type="gramEnd"/>
+      <w:r>
+        <w:t xml:space="preserve">16, eps=1e-05, momentum=0.1, affine=True, </w:t>
+      </w:r>
+      <w:proofErr w:type="spellStart"/>
+      <w:r>
+        <w:t>track_running_stats</w:t>
+      </w:r>
+      <w:proofErr w:type="spellEnd"/>
+      <w:r>
+        <w:t>=True)</w:t>
+      </w:r>
+    </w:p>
+    <w:p>
+      <w:r>
+        <w:t xml:space="preserve">  (conv2): Conv2</w:t>
+      </w:r>
+      <w:proofErr w:type="gramStart"/>
+      <w:r>
+        <w:t>d(</w:t>
+      </w:r>
+      <w:proofErr w:type="gramEnd"/>
+      <w:r>
+        <w:t xml:space="preserve">16, 32, </w:t>
+      </w:r>
+      <w:proofErr w:type="spellStart"/>
+      <w:r>
+        <w:t>kernel_size</w:t>
+      </w:r>
+      <w:proofErr w:type="spellEnd"/>
+      <w:proofErr w:type="gramStart"/>
+      <w:r>
+        <w:t>=(</w:t>
+      </w:r>
+      <w:proofErr w:type="gramEnd"/>
+      <w:r>
+        <w:t>3, 3), stride</w:t>
+      </w:r>
+      <w:proofErr w:type="gramStart"/>
+      <w:r>
+        <w:t>=(</w:t>
+      </w:r>
+      <w:proofErr w:type="gramEnd"/>
+      <w:r>
+        <w:t>1, 1), padding</w:t>
+      </w:r>
+      <w:proofErr w:type="gramStart"/>
+      <w:r>
+        <w:t>=(</w:t>
+      </w:r>
+      <w:proofErr w:type="gramEnd"/>
+      <w:r>
+        <w:t>1, 1))</w:t>
+      </w:r>
+    </w:p>
+    <w:p>
+      <w:r>
+        <w:t xml:space="preserve">  (conv3): Conv2</w:t>
+      </w:r>
+      <w:proofErr w:type="gramStart"/>
+      <w:r>
+        <w:t>d(</w:t>
+      </w:r>
+      <w:proofErr w:type="gramEnd"/>
+      <w:r>
+        <w:t xml:space="preserve">32, 64, </w:t>
+      </w:r>
+      <w:proofErr w:type="spellStart"/>
+      <w:r>
+        <w:t>kernel_size</w:t>
+      </w:r>
+      <w:proofErr w:type="spellEnd"/>
+      <w:proofErr w:type="gramStart"/>
+      <w:r>
+        <w:t>=(</w:t>
+      </w:r>
+      <w:proofErr w:type="gramEnd"/>
+      <w:r>
+        <w:t>3, 3), stride</w:t>
+      </w:r>
+      <w:proofErr w:type="gramStart"/>
+      <w:r>
+        <w:t>=(</w:t>
+      </w:r>
+      <w:proofErr w:type="gramEnd"/>
+      <w:r>
+        <w:t>1, 1), padding</w:t>
+      </w:r>
+      <w:proofErr w:type="gramStart"/>
+      <w:r>
+        <w:t>=(</w:t>
+      </w:r>
+      <w:proofErr w:type="gramEnd"/>
+      <w:r>
+        <w:t>1, 1))</w:t>
+      </w:r>
+    </w:p>
+    <w:p>
+      <w:r>
+        <w:t xml:space="preserve">  (bn2): BatchNorm2</w:t>
+      </w:r>
+      <w:proofErr w:type="gramStart"/>
+      <w:r>
+        <w:t>d(</w:t>
+      </w:r>
+      <w:proofErr w:type="gramEnd"/>
+      <w:r>
+        <w:t xml:space="preserve">64, eps=1e-05, momentum=0.1, affine=True, </w:t>
+      </w:r>
+      <w:proofErr w:type="spellStart"/>
+      <w:r>
+        <w:t>track_running_stats</w:t>
+      </w:r>
+      <w:proofErr w:type="spellEnd"/>
+      <w:r>
+        <w:t>=True)</w:t>
+      </w:r>
+    </w:p>
+    <w:p>
+      <w:r>
+        <w:t xml:space="preserve">  (conv4): Conv2</w:t>
+      </w:r>
+      <w:proofErr w:type="gramStart"/>
+      <w:r>
+        <w:t>d(</w:t>
+      </w:r>
+      <w:proofErr w:type="gramEnd"/>
+      <w:r>
+        <w:t xml:space="preserve">64, 128, </w:t>
+      </w:r>
+      <w:proofErr w:type="spellStart"/>
+      <w:r>
+        <w:t>kernel_size</w:t>
+      </w:r>
+      <w:proofErr w:type="spellEnd"/>
+      <w:proofErr w:type="gramStart"/>
+      <w:r>
+        <w:t>=(</w:t>
+      </w:r>
+      <w:proofErr w:type="gramEnd"/>
+      <w:r>
+        <w:t>3, 3), stride</w:t>
+      </w:r>
+      <w:proofErr w:type="gramStart"/>
+      <w:r>
+        <w:t>=(</w:t>
+      </w:r>
+      <w:proofErr w:type="gramEnd"/>
+      <w:r>
+        <w:t>1, 1), padding</w:t>
+      </w:r>
+      <w:proofErr w:type="gramStart"/>
+      <w:r>
+        <w:t>=(</w:t>
+      </w:r>
+      <w:proofErr w:type="gramEnd"/>
+      <w:r>
+        <w:t>1, 1))</w:t>
+      </w:r>
+    </w:p>
+    <w:p>
+      <w:r>
+        <w:t xml:space="preserve">  (conv5): Conv2</w:t>
+      </w:r>
+      <w:proofErr w:type="gramStart"/>
+      <w:r>
+        <w:t>d(</w:t>
+      </w:r>
+      <w:proofErr w:type="gramEnd"/>
+      <w:r>
+        <w:t xml:space="preserve">128, 256, </w:t>
+      </w:r>
+      <w:proofErr w:type="spellStart"/>
+      <w:r>
+        <w:t>kernel_size</w:t>
+      </w:r>
+      <w:proofErr w:type="spellEnd"/>
+      <w:proofErr w:type="gramStart"/>
+      <w:r>
+        <w:t>=(</w:t>
+      </w:r>
+      <w:proofErr w:type="gramEnd"/>
+      <w:r>
+        <w:t>3, 3), stride</w:t>
+      </w:r>
+      <w:proofErr w:type="gramStart"/>
+      <w:r>
+        <w:t>=(</w:t>
+      </w:r>
+      <w:proofErr w:type="gramEnd"/>
+      <w:r>
+        <w:t>1, 1), padding</w:t>
+      </w:r>
+      <w:proofErr w:type="gramStart"/>
+      <w:r>
+        <w:t>=(</w:t>
+      </w:r>
+      <w:proofErr w:type="gramEnd"/>
+      <w:r>
+        <w:t>1, 1))</w:t>
+      </w:r>
+    </w:p>
+    <w:p>
+      <w:r>
+        <w:t xml:space="preserve">  (pool): MaxPool2</w:t>
+      </w:r>
+      <w:proofErr w:type="gramStart"/>
+      <w:r>
+        <w:t>d(</w:t>
+      </w:r>
+      <w:proofErr w:type="spellStart"/>
+      <w:proofErr w:type="gramEnd"/>
+      <w:r>
+        <w:t>kernel_size</w:t>
+      </w:r>
+      <w:proofErr w:type="spellEnd"/>
+      <w:r>
+        <w:t xml:space="preserve">=2, stride=2, padding=0, dilation=1, </w:t>
+      </w:r>
+      <w:proofErr w:type="spellStart"/>
+      <w:r>
+        <w:t>ceil_mode</w:t>
+      </w:r>
+      <w:proofErr w:type="spellEnd"/>
+      <w:r>
+        <w:t>=False)</w:t>
+      </w:r>
+    </w:p>
+    <w:p>
+      <w:r>
+        <w:t xml:space="preserve">  (dropout): </w:t>
+      </w:r>
+      <w:proofErr w:type="gramStart"/>
+      <w:r>
+        <w:t>Dropout(</w:t>
+      </w:r>
+      <w:proofErr w:type="gramEnd"/>
+      <w:r>
+        <w:t xml:space="preserve">p=0.3, </w:t>
+      </w:r>
+      <w:proofErr w:type="spellStart"/>
+      <w:r>
+        <w:t>inplace</w:t>
+      </w:r>
+      <w:proofErr w:type="spellEnd"/>
+      <w:r>
+        <w:t>=False)</w:t>
+      </w:r>
+    </w:p>
+    <w:p>
+      <w:r>
+        <w:t xml:space="preserve">  (fc1): </w:t>
+      </w:r>
+      <w:proofErr w:type="gramStart"/>
+      <w:r>
+        <w:t>Linear(</w:t>
+      </w:r>
+      <w:proofErr w:type="spellStart"/>
+      <w:proofErr w:type="gramEnd"/>
+      <w:r>
+        <w:t>in_features</w:t>
+      </w:r>
+      <w:proofErr w:type="spellEnd"/>
+      <w:r>
+        <w:t xml:space="preserve">=12544, </w:t>
+      </w:r>
+      <w:proofErr w:type="spellStart"/>
+      <w:r>
+        <w:t>out_features</w:t>
+      </w:r>
+      <w:proofErr w:type="spellEnd"/>
+      <w:r>
+        <w:t>=256, bias=True)</w:t>
+      </w:r>
+    </w:p>
+    <w:p>
+      <w:r>
+        <w:t xml:space="preserve">  (fc2): </w:t>
+      </w:r>
+      <w:proofErr w:type="gramStart"/>
+      <w:r>
+        <w:t>Linear(</w:t>
+      </w:r>
+      <w:proofErr w:type="spellStart"/>
+      <w:proofErr w:type="gramEnd"/>
+      <w:r>
+        <w:t>in_features</w:t>
+      </w:r>
+      <w:proofErr w:type="spellEnd"/>
+      <w:r>
+        <w:t xml:space="preserve">=256, </w:t>
+      </w:r>
+      <w:proofErr w:type="spellStart"/>
+      <w:r>
+        <w:t>out_features</w:t>
+      </w:r>
+      <w:proofErr w:type="spellEnd"/>
+      <w:r>
+        <w:t>=128, bias=True)</w:t>
+      </w:r>
+    </w:p>
+    <w:p>
+      <w:r>
+        <w:lastRenderedPageBreak/>
+        <w:t xml:space="preserve">  (fc3): </w:t>
+      </w:r>
+      <w:proofErr w:type="gramStart"/>
+      <w:r>
+        <w:t>Linear(</w:t>
+      </w:r>
+      <w:proofErr w:type="spellStart"/>
+      <w:proofErr w:type="gramEnd"/>
+      <w:r>
+        <w:t>in_features</w:t>
+      </w:r>
+      <w:proofErr w:type="spellEnd"/>
+      <w:r>
+        <w:t xml:space="preserve">=128, </w:t>
+      </w:r>
+      <w:proofErr w:type="spellStart"/>
+      <w:r>
+        <w:t>out_features</w:t>
+      </w:r>
+      <w:proofErr w:type="spellEnd"/>
+      <w:r>
+        <w:t>=64, bias=True)</w:t>
+      </w:r>
+    </w:p>
+    <w:p>
+      <w:r>
+        <w:t xml:space="preserve">  (fc4): </w:t>
+      </w:r>
+      <w:proofErr w:type="gramStart"/>
+      <w:r>
+        <w:t>Linear(</w:t>
+      </w:r>
+      <w:proofErr w:type="spellStart"/>
+      <w:proofErr w:type="gramEnd"/>
+      <w:r>
+        <w:t>in_features</w:t>
+      </w:r>
+      <w:proofErr w:type="spellEnd"/>
+      <w:r>
+        <w:t xml:space="preserve">=64, </w:t>
+      </w:r>
+      <w:proofErr w:type="spellStart"/>
+      <w:r>
+        <w:t>out_features</w:t>
+      </w:r>
+      <w:proofErr w:type="spellEnd"/>
+      <w:r>
+        <w:t>=32, bias=True)</w:t>
+      </w:r>
+    </w:p>
+    <w:p>
+      <w:r>
+        <w:t xml:space="preserve">  (out): </w:t>
+      </w:r>
+      <w:proofErr w:type="gramStart"/>
+      <w:r>
+        <w:t>Linear(</w:t>
+      </w:r>
+      <w:proofErr w:type="spellStart"/>
+      <w:proofErr w:type="gramEnd"/>
+      <w:r>
+        <w:t>in_features</w:t>
+      </w:r>
+      <w:proofErr w:type="spellEnd"/>
+      <w:r>
+        <w:t xml:space="preserve">=32, </w:t>
+      </w:r>
+      <w:proofErr w:type="spellStart"/>
+      <w:r>
+        <w:t>out_features</w:t>
+      </w:r>
+      <w:proofErr w:type="spellEnd"/>
+      <w:r>
+        <w:t>=7, bias=True)</w:t>
+      </w:r>
+    </w:p>
+    <w:p>
+      <w:r>
+        <w:t>)</w:t>
+      </w:r>
+    </w:p>
+    <w:p>
+      <w:r>
+        <w:t>Epoch [1/30]</w:t>
+      </w:r>
+    </w:p>
+    <w:p>
+      <w:r>
+        <w:t>Train Loss: 1.0385, Train Acc: 66.63%</w:t>
+      </w:r>
+    </w:p>
+    <w:p>
+      <w:r>
+        <w:t>Val   Loss: 1.0387, Val   Acc: 67.71%</w:t>
+      </w:r>
+    </w:p>
+    <w:p/>
+    <w:p>
+      <w:r>
+        <w:t>Epoch [2/30]</w:t>
+      </w:r>
+    </w:p>
+    <w:p>
+      <w:r>
+        <w:t>Train Loss: 0.9540, Train Acc: 67.60%</w:t>
+      </w:r>
+    </w:p>
+    <w:p>
+      <w:r>
+        <w:t>Val   Loss: 0.9020, Val   Acc: 70.04%</w:t>
+      </w:r>
+    </w:p>
+    <w:p/>
+    <w:p>
+      <w:r>
+        <w:t>Epoch [3/30]</w:t>
+      </w:r>
+    </w:p>
+    <w:p>
+      <w:r>
+        <w:t>Train Loss: 0.8980, Train Acc: 67.92%</w:t>
+      </w:r>
+    </w:p>
+    <w:p>
+      <w:r>
+        <w:t>Val   Loss: 0.8329, Val   Acc: 69.91%</w:t>
+      </w:r>
+    </w:p>
+    <w:p/>
+    <w:p>
+      <w:r>
+        <w:t>Epoch [4/30]</w:t>
+      </w:r>
+    </w:p>
+    <w:p>
+      <w:r>
+        <w:t>Train Loss: 0.8898, Train Acc: 68.52%</w:t>
+      </w:r>
+    </w:p>
+    <w:p>
+      <w:r>
+        <w:t>Val   Loss: 0.8353, Val   Acc: 68.44%</w:t>
+      </w:r>
+    </w:p>
+    <w:p/>
+    <w:p>
+      <w:r>
+        <w:t>Epoch [5/30]</w:t>
+      </w:r>
+    </w:p>
+    <w:p>
+      <w:r>
+        <w:t>Train Loss: 0.8711, Train Acc: 69.09%</w:t>
+      </w:r>
+    </w:p>
+    <w:p>
+      <w:r>
+        <w:t>Val   Loss: 0.8153, Val   Acc: 71.24%</w:t>
+      </w:r>
+    </w:p>
+    <w:p/>
+    <w:p>
+      <w:r>
+        <w:t>Epoch [6/30]</w:t>
+      </w:r>
+    </w:p>
+    <w:p>
+      <w:r>
+        <w:t>Train Loss: 0.8534, Train Acc: 69.87%</w:t>
+      </w:r>
+    </w:p>
+    <w:p>
+      <w:r>
+        <w:lastRenderedPageBreak/>
+        <w:t>Val   Loss: 0.7780, Val   Acc: 71.64%</w:t>
+      </w:r>
+    </w:p>
+    <w:p/>
+    <w:p>
+      <w:r>
+        <w:t>Epoch [7/30]</w:t>
+      </w:r>
+    </w:p>
+    <w:p>
+      <w:r>
+        <w:t>Train Loss: 0.8381, Train Acc: 70.14%</w:t>
+      </w:r>
+    </w:p>
+    <w:p>
+      <w:r>
+        <w:t>Val   Loss: 0.8709, Val   Acc: 72.24%</w:t>
+      </w:r>
+    </w:p>
+    <w:p/>
+    <w:p>
+      <w:r>
+        <w:t>Epoch [8/30]</w:t>
+      </w:r>
+    </w:p>
+    <w:p>
+      <w:r>
+        <w:t>Train Loss: 0.8298, Train Acc: 70.26%</w:t>
+      </w:r>
+    </w:p>
+    <w:p>
+      <w:r>
+        <w:t>Val   Loss: 0.7690, Val   Acc: 73.44%</w:t>
+      </w:r>
+    </w:p>
+    <w:p/>
+    <w:p>
+      <w:r>
+        <w:t>Epoch [9/30]</w:t>
+      </w:r>
+    </w:p>
+    <w:p>
+      <w:r>
+        <w:t>Train Loss: 0.8111, Train Acc: 70.83%</w:t>
+      </w:r>
+    </w:p>
+    <w:p>
+      <w:r>
+        <w:t>Val   Loss: 0.7893, Val   Acc: 71.97%</w:t>
+      </w:r>
+    </w:p>
+    <w:p/>
+    <w:p>
+      <w:r>
+        <w:t>Epoch [10/30]</w:t>
+      </w:r>
+    </w:p>
+    <w:p>
+      <w:r>
+        <w:t>Train Loss: 0.8256, Train Acc: 70.76%</w:t>
+      </w:r>
+    </w:p>
+    <w:p>
+      <w:r>
+        <w:t>Val   Loss: 0.7935, Val   Acc: 71.50%</w:t>
+      </w:r>
+    </w:p>
+    <w:p/>
+    <w:p>
+      <w:r>
+        <w:t>Epoch [11/30]</w:t>
+      </w:r>
+    </w:p>
+    <w:p>
+      <w:r>
+        <w:t>Train Loss: 0.7972, Train Acc: 71.60%</w:t>
+      </w:r>
+    </w:p>
+    <w:p>
+      <w:r>
+        <w:t>Epoch [9/30]</w:t>
+      </w:r>
+    </w:p>
+    <w:p>
+      <w:r>
+        <w:t>Train Loss: 0.8111, Train Acc: 70.83%</w:t>
+      </w:r>
+    </w:p>
+    <w:p>
+      <w:r>
+        <w:t>Val   Loss: 0.7893, Val   Acc: 71.97%</w:t>
+      </w:r>
+    </w:p>
+    <w:p/>
+    <w:p>
+      <w:r>
+        <w:t>Epoch [10/30]</w:t>
+      </w:r>
+    </w:p>
+    <w:p>
+      <w:r>
+        <w:t>Train Loss: 0.8256, Train Acc: 70.76%</w:t>
+      </w:r>
+    </w:p>
+    <w:p>
+      <w:r>
+        <w:lastRenderedPageBreak/>
+        <w:t>Val   Loss: 0.7935, Val   Acc: 71.50%</w:t>
+      </w:r>
+    </w:p>
+    <w:p>
+      <w:r>
+        <w:t>Epoch [9/30]</w:t>
+      </w:r>
+    </w:p>
+    <w:p>
+      <w:r>
+        <w:t>Train Loss: 0.8111, Train Acc: 70.83%</w:t>
+      </w:r>
+    </w:p>
+    <w:p>
+      <w:r>
+        <w:t>Val   Loss: 0.7893, Val   Acc: 71.97%</w:t>
+      </w:r>
+    </w:p>
+    <w:p/>
+    <w:p>
+      <w:r>
+        <w:t>Epoch [9/30]</w:t>
+      </w:r>
+    </w:p>
+    <w:p>
+      <w:r>
+        <w:t>Train Loss: 0.8111, Train Acc: 70.83%</w:t>
+      </w:r>
+    </w:p>
+    <w:p>
+      <w:r>
+        <w:t>Epoch [9/30]</w:t>
+      </w:r>
+    </w:p>
+    <w:p>
+      <w:r>
+        <w:t>Epoch [9/30]</w:t>
+      </w:r>
+    </w:p>
+    <w:p>
+      <w:r>
+        <w:t>Train Loss: 0.8111, Train Acc: 70.83%</w:t>
+      </w:r>
+    </w:p>
+    <w:p>
+      <w:r>
+        <w:t>Epoch [9/30]</w:t>
+      </w:r>
+    </w:p>
+    <w:p>
+      <w:r>
+        <w:t>Epoch [9/30]</w:t>
+      </w:r>
+    </w:p>
+    <w:p>
+      <w:r>
+        <w:t>Epoch [9/30]</w:t>
+      </w:r>
+    </w:p>
+    <w:p>
+      <w:r>
+        <w:t>Train Loss: 0.8111, Train Acc: 70.83%</w:t>
+      </w:r>
+    </w:p>
+    <w:p>
+      <w:r>
+        <w:t>Epoch [9/30]</w:t>
+      </w:r>
+    </w:p>
+    <w:p>
+      <w:r>
+        <w:t>Train Loss: 0.8111, Train Acc: 70.83%</w:t>
+      </w:r>
+    </w:p>
+    <w:p>
+      <w:r>
+        <w:t>Val   Loss: 0.7893, Val   Acc: 71.97%</w:t>
+      </w:r>
+    </w:p>
+    <w:p/>
+    <w:p>
+      <w:r>
+        <w:t>Epoch [10/30]</w:t>
+      </w:r>
+    </w:p>
+    <w:p>
+      <w:r>
+        <w:t>Train Loss: 0.8256, Train Acc: 70.76%</w:t>
+      </w:r>
+    </w:p>
+    <w:p>
+      <w:r>
+        <w:t>Val   Loss: 0.7935, Val   Acc: 71.50%</w:t>
+      </w:r>
+    </w:p>
+    <w:p>
+      <w:r>
+        <w:t>Epoch [9/30]</w:t>
+      </w:r>
+    </w:p>
+    <w:p>
+      <w:r>
+        <w:t>Train Loss: 0.8111, Train Acc: 70.83%</w:t>
+      </w:r>
+    </w:p>
+    <w:p>
+      <w:r>
+        <w:t>Val   Loss: 0.7893, Val   Acc: 71.97%</w:t>
+      </w:r>
+    </w:p>
+    <w:p/>
+    <w:p>
+      <w:r>
+        <w:t>Epoch [10/30]</w:t>
+      </w:r>
+    </w:p>
+    <w:p>
+      <w:r>
+        <w:lastRenderedPageBreak/>
+        <w:t>Train Loss: 0.8256, Train Acc: 70.76%</w:t>
+      </w:r>
+    </w:p>
+    <w:p>
+      <w:r>
+        <w:t>Val   Loss: 0.7935, Val   Acc: 71.50%</w:t>
+      </w:r>
+    </w:p>
+    <w:p>
+      <w:r>
+        <w:t>Epoch [9/30]</w:t>
+      </w:r>
+    </w:p>
+    <w:p>
+      <w:r>
+        <w:t>Train Loss: 0.8111, Train Acc: 70.83%</w:t>
+      </w:r>
+    </w:p>
+    <w:p>
+      <w:r>
+        <w:t>Val   Loss: 0.7893, Val   Acc: 71.97%</w:t>
+      </w:r>
+    </w:p>
+    <w:p/>
+    <w:p>
+      <w:r>
+        <w:t>Epoch [10/30]</w:t>
+      </w:r>
+    </w:p>
+    <w:p>
+      <w:r>
+        <w:t>Train Loss: 0.8256, Train Acc: 70.76%</w:t>
+      </w:r>
+    </w:p>
+    <w:p>
+      <w:r>
+        <w:t>Val   Loss: 0.7935, Val   Acc: 71.50%</w:t>
+      </w:r>
+    </w:p>
+    <w:p>
+      <w:r>
+        <w:t>Train Loss: 0.8111, Train Acc: 70.83%</w:t>
+      </w:r>
+    </w:p>
+    <w:p>
+      <w:r>
+        <w:t>Val   Loss: 0.7893, Val   Acc: 71.97%</w:t>
+      </w:r>
+    </w:p>
+    <w:p/>
+    <w:p>
+      <w:r>
+        <w:t>Epoch [10/30]</w:t>
+      </w:r>
+    </w:p>
+    <w:p>
+      <w:r>
+        <w:t>Train Loss: 0.8256, Train Acc: 70.76%</w:t>
+      </w:r>
+    </w:p>
+    <w:p/>
+    <w:p>
+      <w:r>
+        <w:t>Epoch [10/30]</w:t>
+      </w:r>
+    </w:p>
+    <w:p>
+      <w:r>
+        <w:t>Train Loss: 0.8256, Train Acc: 70.76%</w:t>
+      </w:r>
+    </w:p>
+    <w:p>
+      <w:r>
+        <w:t>Train Loss: 0.8256, Train Acc: 70.76%</w:t>
+      </w:r>
+    </w:p>
+    <w:p>
+      <w:r>
+        <w:t>Val   Loss: 0.7935, Val   Acc: 71.50%</w:t>
+      </w:r>
+    </w:p>
+    <w:p/>
+    <w:p>
+      <w:r>
+        <w:t>Epoch [11/30]</w:t>
+      </w:r>
+    </w:p>
+    <w:p>
+      <w:r>
+        <w:t>Train Loss: 0.7972, Train Acc: 71.60%</w:t>
+      </w:r>
+    </w:p>
+    <w:p>
+      <w:r>
+        <w:t>Val   Loss: 0.7890, Val   Acc: 71.90%</w:t>
+      </w:r>
+    </w:p>
+    <w:p/>
+    <w:p>
+      <w:r>
+        <w:t>Epoch [12/30]</w:t>
+      </w:r>
+    </w:p>
+    <w:p>
+      <w:r>
+        <w:t>Train Loss: 0.7900, Train Acc: 71.58%</w:t>
+      </w:r>
+    </w:p>
+    <w:p>
+      <w:r>
+        <w:lastRenderedPageBreak/>
+        <w:t>Val   Loss: 0.8038, Val   Acc: 72.30%</w:t>
+      </w:r>
+    </w:p>
+    <w:p/>
+    <w:p>
+      <w:r>
+        <w:t>Epoch [13/30]</w:t>
+      </w:r>
+    </w:p>
+    <w:p>
+      <w:r>
+        <w:t>Train Loss: 0.7868, Train Acc: 71.81%</w:t>
+      </w:r>
+    </w:p>
+    <w:p>
+      <w:r>
+        <w:t>Val   Loss: 0.7568, Val   Acc: 75.10%</w:t>
+      </w:r>
+    </w:p>
+    <w:p/>
+    <w:p>
+      <w:r>
+        <w:t>Epoch [14/30]</w:t>
+      </w:r>
+    </w:p>
+    <w:p>
+      <w:r>
+        <w:t>Train Loss: 0.7695, Train Acc: 72.17%</w:t>
+      </w:r>
+    </w:p>
+    <w:p>
+      <w:r>
+        <w:t>Val   Loss: 0.7463, Val   Acc: 73.50%</w:t>
+      </w:r>
+    </w:p>
+    <w:p/>
+    <w:p>
+      <w:r>
+        <w:t>Epoch [15/30]</w:t>
+      </w:r>
+    </w:p>
+    <w:p>
+      <w:r>
+        <w:t>Train Loss: 0.7699, Train Acc: 71.90%</w:t>
+      </w:r>
+    </w:p>
+    <w:p>
+      <w:r>
+        <w:t>Val   Loss: 0.8149, Val   Acc: 72.97%</w:t>
+      </w:r>
+    </w:p>
+    <w:p/>
+    <w:p>
+      <w:r>
+        <w:t>Epoch [16/30]</w:t>
+      </w:r>
+    </w:p>
+    <w:p>
+      <w:r>
+        <w:t>Train Loss: 0.7694, Train Acc: 72.65%</w:t>
+      </w:r>
+    </w:p>
+    <w:p>
+      <w:r>
+        <w:t>Val   Loss: 0.7540, Val   Acc: 72.77%</w:t>
+      </w:r>
+    </w:p>
+    <w:p/>
+    <w:p>
+      <w:r>
+        <w:t>Epoch [17/30]</w:t>
+      </w:r>
+    </w:p>
+    <w:p>
+      <w:r>
+        <w:t>Train Loss: 0.7699, Train Acc: 72.33%</w:t>
+      </w:r>
+    </w:p>
+    <w:p>
+      <w:r>
+        <w:t>Val   Loss: 0.8153, Val   Acc: 73.44%</w:t>
+      </w:r>
+    </w:p>
+    <w:p/>
+    <w:p>
+      <w:r>
+        <w:t>Epoch [18/30]</w:t>
+      </w:r>
+    </w:p>
+    <w:p>
+      <w:r>
+        <w:t>Train Loss: 0.7376, Train Acc: 73.32%</w:t>
+      </w:r>
+    </w:p>
+    <w:p>
+      <w:r>
+        <w:t>Val   Loss: 0.7397, Val   Acc: 72.30%</w:t>
+      </w:r>
+    </w:p>
+    <w:p/>
+    <w:p>
+      <w:r>
+        <w:lastRenderedPageBreak/>
+        <w:t>Epoch [19/30]</w:t>
+      </w:r>
+    </w:p>
+    <w:p>
+      <w:r>
+        <w:t>Train Loss: 0.7522, Train Acc: 73.07%</w:t>
+      </w:r>
+    </w:p>
+    <w:p>
+      <w:r>
+        <w:t>Val   Loss: 0.7498, Val   Acc: 73.24%</w:t>
+      </w:r>
+    </w:p>
+    <w:p/>
+    <w:p>
+      <w:r>
+        <w:t>Epoch [20/30]</w:t>
+      </w:r>
+    </w:p>
+    <w:p>
+      <w:r>
+        <w:t>Train Loss: 0.7385, Train Acc: 73.27%</w:t>
+      </w:r>
+    </w:p>
+    <w:p>
+      <w:r>
+        <w:t>Val   Loss: 0.7162, Val   Acc: 75.03%</w:t>
+      </w:r>
+    </w:p>
+    <w:p/>
+    <w:p>
+      <w:r>
+        <w:t>Epoch [21/30]</w:t>
+      </w:r>
+    </w:p>
+    <w:p>
+      <w:r>
+        <w:t>Train Loss: 0.7133, Train Acc: 73.91%</w:t>
+      </w:r>
+    </w:p>
+    <w:p>
+      <w:r>
+        <w:t>Val   Loss: 0.7519, Val   Acc: 75.23%</w:t>
+      </w:r>
+    </w:p>
+    <w:p/>
+    <w:p>
+      <w:r>
+        <w:t>Epoch [22/30]</w:t>
+      </w:r>
+    </w:p>
+    <w:p>
+      <w:r>
+        <w:t>Train Loss: 0.7035, Train Acc: 74.55%</w:t>
+      </w:r>
+    </w:p>
+    <w:p>
+      <w:r>
+        <w:t>Val   Loss: 0.7383, Val   Acc: 74.70%</w:t>
+      </w:r>
+    </w:p>
+    <w:p/>
+    <w:p>
+      <w:r>
+        <w:t>Epoch [23/30]</w:t>
+      </w:r>
+    </w:p>
+    <w:p>
+      <w:r>
+        <w:t>Train Loss: 0.7055, Train Acc: 74.48%</w:t>
+      </w:r>
+    </w:p>
+    <w:p>
+      <w:r>
+        <w:t>Val   Loss: 0.7398, Val   Acc: 74.43%</w:t>
+      </w:r>
+    </w:p>
+    <w:p/>
+    <w:p>
+      <w:r>
+        <w:t>Epoch [24/30]</w:t>
+      </w:r>
+    </w:p>
+    <w:p>
+      <w:r>
+        <w:t>Train Loss: 0.6966, Train Acc: 74.34%</w:t>
+      </w:r>
+    </w:p>
+    <w:p>
+      <w:r>
+        <w:t>Val   Loss: 0.6938, Val   Acc: 75.90%</w:t>
+      </w:r>
+    </w:p>
+    <w:p/>
+    <w:p>
+      <w:r>
+        <w:t>Epoch [25/30]</w:t>
+      </w:r>
+    </w:p>
+    <w:p>
+      <w:r>
+        <w:t>Train Loss: 0.6848, Train Acc: 75.15%</w:t>
+      </w:r>
+    </w:p>
+    <w:p>
+      <w:r>
+        <w:lastRenderedPageBreak/>
+        <w:t>Val   Loss: 0.6924, Val   Acc: 74.63%</w:t>
+      </w:r>
+    </w:p>
+    <w:p/>
+    <w:p>
+      <w:r>
+        <w:t>Epoch [26/30]</w:t>
+      </w:r>
+    </w:p>
+    <w:p>
+      <w:r>
+        <w:t>Train Loss: 0.6821, Train Acc: 74.76%</w:t>
+      </w:r>
+    </w:p>
+    <w:p>
+      <w:r>
+        <w:t>Val   Loss: 0.7513, Val   Acc: 75.30%</w:t>
+      </w:r>
+    </w:p>
+    <w:p/>
+    <w:p>
+      <w:r>
+        <w:t>Epoch [27/30]</w:t>
+      </w:r>
+    </w:p>
+    <w:p>
+      <w:r>
+        <w:t>Train Loss: 0.6727, Train Acc: 75.78%</w:t>
+      </w:r>
+    </w:p>
+    <w:p>
+      <w:r>
+        <w:t>Val   Loss: 0.7292, Val   Acc: 73.97%</w:t>
+      </w:r>
+    </w:p>
+    <w:p/>
+    <w:p>
+      <w:r>
+        <w:t>Epoch [28/30]</w:t>
+      </w:r>
+    </w:p>
+    <w:p>
+      <w:r>
+        <w:t>Train Loss: 0.6679, Train Acc: 75.92%</w:t>
+      </w:r>
+    </w:p>
+    <w:p>
+      <w:r>
+        <w:t>Val   Loss: 0.7178, Val   Acc: 74.57%</w:t>
+      </w:r>
+    </w:p>
+    <w:p/>
+    <w:p>
+      <w:r>
+        <w:t>Epoch [29/30]</w:t>
+      </w:r>
+    </w:p>
+    <w:p>
+      <w:r>
+        <w:t>Train Loss: 0.6610, Train Acc: 75.82%</w:t>
+      </w:r>
+    </w:p>
+    <w:p>
+      <w:r>
+        <w:t>Val   Loss: 0.7220, Val   Acc: 75.17%</w:t>
+      </w:r>
+    </w:p>
+    <w:p/>
+    <w:p>
+      <w:r>
+        <w:t>Epoch [30/30]</w:t>
+      </w:r>
+    </w:p>
+    <w:p>
+      <w:r>
+        <w:t>Train Loss: 0.6722, Train Acc: 75.69%</w:t>
+      </w:r>
+    </w:p>
+    <w:p>
+      <w:r>
+        <w:t>Val   Loss: 0.7173, Val   Acc: 75.03%</w:t>
+      </w:r>
+    </w:p>
+    <w:p/>
+    <w:p>
+      <w:r>
+        <w:t xml:space="preserve">C:\Users\Hp\AppData\Roaming\Python\Python314\site-packages\sklearn\metrics\_classification.py:1833: </w:t>
+      </w:r>
+      <w:proofErr w:type="spellStart"/>
+      <w:r>
+        <w:t>UndefinedMetricWarning</w:t>
+      </w:r>
+      <w:proofErr w:type="spellEnd"/>
+      <w:r>
+        <w:t>: Precision is ill-defined and being set to 0.0 in labels with no predicted samples. Use `</w:t>
+      </w:r>
+      <w:proofErr w:type="spellStart"/>
+      <w:r>
+        <w:t>zero_division</w:t>
+      </w:r>
+      <w:proofErr w:type="spellEnd"/>
+      <w:r>
+        <w:t>` parameter to control this behavior.</w:t>
+      </w:r>
+    </w:p>
+    <w:p>
+      <w:r>
+        <w:t xml:space="preserve">  _</w:t>
+      </w:r>
+      <w:proofErr w:type="spellStart"/>
+      <w:r>
+        <w:t>warn_</w:t>
+      </w:r>
+      <w:proofErr w:type="gramStart"/>
+      <w:r>
+        <w:t>prf</w:t>
+      </w:r>
+      <w:proofErr w:type="spellEnd"/>
+      <w:r>
+        <w:t>(</w:t>
+      </w:r>
+      <w:proofErr w:type="gramEnd"/>
+      <w:r>
+        <w:t>average, modifier, f"{</w:t>
+      </w:r>
+      <w:proofErr w:type="spellStart"/>
+      <w:proofErr w:type="gramStart"/>
+      <w:r>
+        <w:t>metric.capitalize</w:t>
+      </w:r>
+      <w:proofErr w:type="spellEnd"/>
+      <w:proofErr w:type="gramEnd"/>
+      <w:r>
+        <w:t xml:space="preserve">()} is", </w:t>
+      </w:r>
+      <w:proofErr w:type="spellStart"/>
+      <w:proofErr w:type="gramStart"/>
+      <w:r>
+        <w:t>result.shape</w:t>
+      </w:r>
+      <w:proofErr w:type="spellEnd"/>
+      <w:proofErr w:type="gramEnd"/>
+      <w:r>
+        <w:t>[0])</w:t>
+      </w:r>
+    </w:p>
+    <w:p>
+      <w:proofErr w:type="gramStart"/>
+      <w:r>
+        <w:lastRenderedPageBreak/>
+        <w:t>Accuracy :</w:t>
+      </w:r>
+      <w:proofErr w:type="gramEnd"/>
+      <w:r>
+        <w:t xml:space="preserve"> 0.7405189620758483</w:t>
+      </w:r>
+    </w:p>
+    <w:p>
+      <w:r>
+        <w:t>Precision: 0.6998960348818095</w:t>
+      </w:r>
+    </w:p>
+    <w:p>
+      <w:r>
+        <w:t xml:space="preserve">Recall </w:t>
+      </w:r>
+      <w:proofErr w:type="gramStart"/>
+      <w:r>
+        <w:t xml:space="preserve">  :</w:t>
+      </w:r>
+      <w:proofErr w:type="gramEnd"/>
+      <w:r>
+        <w:t xml:space="preserve"> 0.7405189620758483</w:t>
+      </w:r>
+    </w:p>
+    <w:p>
+      <w:r>
+        <w:t xml:space="preserve">F1 </w:t>
+      </w:r>
+      <w:proofErr w:type="gramStart"/>
+      <w:r>
+        <w:t>Score :</w:t>
+      </w:r>
+      <w:proofErr w:type="gramEnd"/>
+      <w:r>
+        <w:t xml:space="preserve"> 0.7012977559417461</w:t>
+      </w:r>
+    </w:p>
+    <w:p/>
+    <w:p>
+      <w:r>
+        <w:t>Confusion Matrix:</w:t>
+      </w:r>
+    </w:p>
+    <w:p>
+      <w:r>
+        <w:t xml:space="preserve"> [[ </w:t>
+      </w:r>
+      <w:proofErr w:type="gramStart"/>
+      <w:r>
+        <w:t>11  17</w:t>
+      </w:r>
+      <w:proofErr w:type="gramEnd"/>
+      <w:r>
+        <w:t xml:space="preserve">   7   0   </w:t>
+      </w:r>
+      <w:proofErr w:type="gramStart"/>
+      <w:r>
+        <w:t>1  13</w:t>
+      </w:r>
+      <w:proofErr w:type="gramEnd"/>
+      <w:r>
+        <w:t xml:space="preserve">   0]</w:t>
+      </w:r>
+    </w:p>
+    <w:p>
+      <w:r>
+        <w:t xml:space="preserve"> </w:t>
+      </w:r>
+      <w:proofErr w:type="gramStart"/>
+      <w:r>
+        <w:t>[  7</w:t>
+      </w:r>
+      <w:proofErr w:type="gramEnd"/>
+      <w:r>
+        <w:t xml:space="preserve">  33   4   0   </w:t>
+      </w:r>
+      <w:proofErr w:type="gramStart"/>
+      <w:r>
+        <w:t>1  29</w:t>
+      </w:r>
+      <w:proofErr w:type="gramEnd"/>
+      <w:r>
+        <w:t xml:space="preserve">   3]</w:t>
+      </w:r>
+    </w:p>
+    <w:p>
+      <w:r>
+        <w:t xml:space="preserve"> </w:t>
+      </w:r>
+      <w:proofErr w:type="gramStart"/>
+      <w:r>
+        <w:t>[  5</w:t>
+      </w:r>
+      <w:proofErr w:type="gramEnd"/>
+      <w:r>
+        <w:t xml:space="preserve">   </w:t>
+      </w:r>
+      <w:proofErr w:type="gramStart"/>
+      <w:r>
+        <w:t>9  46</w:t>
+      </w:r>
+      <w:proofErr w:type="gramEnd"/>
+      <w:r>
+        <w:t xml:space="preserve">   0   </w:t>
+      </w:r>
+      <w:proofErr w:type="gramStart"/>
+      <w:r>
+        <w:t>8  95</w:t>
+      </w:r>
+      <w:proofErr w:type="gramEnd"/>
+      <w:r>
+        <w:t xml:space="preserve">   2]</w:t>
+      </w:r>
+    </w:p>
+    <w:p>
+      <w:r>
+        <w:t xml:space="preserve"> </w:t>
+      </w:r>
+      <w:proofErr w:type="gramStart"/>
+      <w:r>
+        <w:t>[  1</w:t>
+      </w:r>
+      <w:proofErr w:type="gramEnd"/>
+      <w:r>
+        <w:t xml:space="preserve">   7   1   0   1   7   0]</w:t>
+      </w:r>
+    </w:p>
+    <w:p>
+      <w:r>
+        <w:t xml:space="preserve"> </w:t>
+      </w:r>
+      <w:proofErr w:type="gramStart"/>
+      <w:r>
+        <w:t>[  4</w:t>
+      </w:r>
+      <w:proofErr w:type="gramEnd"/>
+      <w:r>
+        <w:t xml:space="preserve">   </w:t>
+      </w:r>
+      <w:proofErr w:type="gramStart"/>
+      <w:r>
+        <w:t>6  24</w:t>
+      </w:r>
+      <w:proofErr w:type="gramEnd"/>
+      <w:r>
+        <w:t xml:space="preserve">   </w:t>
+      </w:r>
+      <w:proofErr w:type="gramStart"/>
+      <w:r>
+        <w:t>0  40</w:t>
+      </w:r>
+      <w:proofErr w:type="gramEnd"/>
+      <w:r>
+        <w:t xml:space="preserve">  92   1]</w:t>
+      </w:r>
+    </w:p>
+    <w:p>
+      <w:r>
+        <w:t xml:space="preserve"> </w:t>
+      </w:r>
+      <w:proofErr w:type="gramStart"/>
+      <w:r>
+        <w:t>[  2</w:t>
+      </w:r>
+      <w:proofErr w:type="gramEnd"/>
+      <w:r>
+        <w:t xml:space="preserve">   </w:t>
+      </w:r>
+      <w:proofErr w:type="gramStart"/>
+      <w:r>
+        <w:t>3  12</w:t>
+      </w:r>
+      <w:proofErr w:type="gramEnd"/>
+      <w:r>
+        <w:t xml:space="preserve">   </w:t>
+      </w:r>
+      <w:proofErr w:type="gramStart"/>
+      <w:r>
+        <w:t>0  11</w:t>
+      </w:r>
+      <w:proofErr w:type="gramEnd"/>
+      <w:r>
+        <w:t xml:space="preserve"> 973   5]</w:t>
+      </w:r>
+    </w:p>
+    <w:p>
+      <w:r>
+        <w:t xml:space="preserve"> </w:t>
+      </w:r>
+      <w:proofErr w:type="gramStart"/>
+      <w:r>
+        <w:t>[  1</w:t>
+      </w:r>
+      <w:proofErr w:type="gramEnd"/>
+      <w:r>
+        <w:t xml:space="preserve">   2   0   0   1   </w:t>
+      </w:r>
+      <w:proofErr w:type="gramStart"/>
+      <w:r>
+        <w:t>8  10</w:t>
+      </w:r>
+      <w:proofErr w:type="gramEnd"/>
+      <w:r>
+        <w:t>]]</w:t>
+      </w:r>
+    </w:p>
+    <w:p/>
+    <w:p>
+      <w:r>
+        <w:t>Classification Report:</w:t>
+      </w:r>
+    </w:p>
+    <w:p/>
+    <w:p>
+      <w:r>
+        <w:t xml:space="preserve">C:\Users\Hp\AppData\Roaming\Python\Python314\site-packages\sklearn\metrics\_classification.py:1833: </w:t>
+      </w:r>
+      <w:proofErr w:type="spellStart"/>
+      <w:r>
+        <w:t>UndefinedMetricWarning</w:t>
+      </w:r>
+      <w:proofErr w:type="spellEnd"/>
+      <w:r>
+        <w:t>: Precision is ill-defined and being set to 0.0 in labels with no predicted samples. Use `</w:t>
+      </w:r>
+      <w:proofErr w:type="spellStart"/>
+      <w:r>
+        <w:t>zero_division</w:t>
+      </w:r>
+      <w:proofErr w:type="spellEnd"/>
+      <w:r>
+        <w:t>` parameter to control this behavior.</w:t>
+      </w:r>
+    </w:p>
+    <w:p>
+      <w:r>
+        <w:t xml:space="preserve">  _</w:t>
+      </w:r>
+      <w:proofErr w:type="spellStart"/>
+      <w:r>
+        <w:t>warn_</w:t>
+      </w:r>
+      <w:proofErr w:type="gramStart"/>
+      <w:r>
+        <w:t>prf</w:t>
+      </w:r>
+      <w:proofErr w:type="spellEnd"/>
+      <w:r>
+        <w:t>(</w:t>
+      </w:r>
+      <w:proofErr w:type="gramEnd"/>
+      <w:r>
+        <w:t>average, modifier, f"{</w:t>
+      </w:r>
+      <w:proofErr w:type="spellStart"/>
+      <w:proofErr w:type="gramStart"/>
+      <w:r>
+        <w:t>metric.capitalize</w:t>
+      </w:r>
+      <w:proofErr w:type="spellEnd"/>
+      <w:proofErr w:type="gramEnd"/>
+      <w:r>
+        <w:t xml:space="preserve">()} is", </w:t>
+      </w:r>
+      <w:proofErr w:type="spellStart"/>
+      <w:proofErr w:type="gramStart"/>
+      <w:r>
+        <w:t>result.shape</w:t>
+      </w:r>
+      <w:proofErr w:type="spellEnd"/>
+      <w:proofErr w:type="gramEnd"/>
+      <w:r>
+        <w:t>[0])</w:t>
+      </w:r>
+    </w:p>
+    <w:p>
+      <w:r>
+        <w:t xml:space="preserve">C:\Users\Hp\AppData\Roaming\Python\Python314\site-packages\sklearn\metrics\_classification.py:1833: </w:t>
+      </w:r>
+      <w:proofErr w:type="spellStart"/>
+      <w:r>
+        <w:t>UndefinedMetricWarning</w:t>
+      </w:r>
+      <w:proofErr w:type="spellEnd"/>
+      <w:r>
+        <w:t>: Precision is ill-defined and being set to 0.0 in labels with no predicted samples. Use `</w:t>
+      </w:r>
+      <w:proofErr w:type="spellStart"/>
+      <w:r>
+        <w:t>zero_division</w:t>
+      </w:r>
+      <w:proofErr w:type="spellEnd"/>
+      <w:r>
+        <w:t>` parameter to control this behavior.</w:t>
+      </w:r>
+    </w:p>
+    <w:p>
+      <w:r>
+        <w:t xml:space="preserve">  _</w:t>
+      </w:r>
+      <w:proofErr w:type="spellStart"/>
+      <w:r>
+        <w:t>warn_</w:t>
+      </w:r>
+      <w:proofErr w:type="gramStart"/>
+      <w:r>
+        <w:t>prf</w:t>
+      </w:r>
+      <w:proofErr w:type="spellEnd"/>
+      <w:r>
+        <w:t>(</w:t>
+      </w:r>
+      <w:proofErr w:type="gramEnd"/>
+      <w:r>
+        <w:t>average, modifier, f"{</w:t>
+      </w:r>
+      <w:proofErr w:type="spellStart"/>
+      <w:proofErr w:type="gramStart"/>
+      <w:r>
+        <w:t>metric.capitalize</w:t>
+      </w:r>
+      <w:proofErr w:type="spellEnd"/>
+      <w:proofErr w:type="gramEnd"/>
+      <w:r>
+        <w:t xml:space="preserve">()} is", </w:t>
+      </w:r>
+      <w:proofErr w:type="spellStart"/>
+      <w:proofErr w:type="gramStart"/>
+      <w:r>
+        <w:t>result.shape</w:t>
+      </w:r>
+      <w:proofErr w:type="spellEnd"/>
+      <w:proofErr w:type="gramEnd"/>
+      <w:r>
+        <w:t>[0])</w:t>
+      </w:r>
+    </w:p>
+    <w:p>
+      <w:r>
+        <w:t xml:space="preserve">C:\Users\Hp\AppData\Roaming\Python\Python314\site-packages\sklearn\metrics\_classification.py:1833: </w:t>
+      </w:r>
+      <w:proofErr w:type="spellStart"/>
+      <w:r>
+        <w:t>UndefinedMetricWarning</w:t>
+      </w:r>
+      <w:proofErr w:type="spellEnd"/>
+      <w:r>
+        <w:t xml:space="preserve">: Precision is </w:t>
+      </w:r>
+      <w:r>
+        <w:lastRenderedPageBreak/>
+        <w:t>ill-defined and being set to 0.0 in labels with no predicted samples. Use `</w:t>
+      </w:r>
+      <w:proofErr w:type="spellStart"/>
+      <w:r>
+        <w:t>zero_division</w:t>
+      </w:r>
+      <w:proofErr w:type="spellEnd"/>
+      <w:r>
+        <w:t>` parameter to control this behavior.</w:t>
+      </w:r>
+    </w:p>
+    <w:p>
+      <w:r>
+        <w:t xml:space="preserve">  _</w:t>
+      </w:r>
+      <w:proofErr w:type="spellStart"/>
+      <w:r>
+        <w:t>warn_</w:t>
+      </w:r>
+      <w:proofErr w:type="gramStart"/>
+      <w:r>
+        <w:t>prf</w:t>
+      </w:r>
+      <w:proofErr w:type="spellEnd"/>
+      <w:r>
+        <w:t>(</w:t>
+      </w:r>
+      <w:proofErr w:type="gramEnd"/>
+      <w:r>
+        <w:t>average, modifier, f"{</w:t>
+      </w:r>
+      <w:proofErr w:type="spellStart"/>
+      <w:proofErr w:type="gramStart"/>
+      <w:r>
+        <w:t>metric.capitalize</w:t>
+      </w:r>
+      <w:proofErr w:type="spellEnd"/>
+      <w:proofErr w:type="gramEnd"/>
+      <w:r>
+        <w:t xml:space="preserve">()} is", </w:t>
+      </w:r>
+      <w:proofErr w:type="spellStart"/>
+      <w:proofErr w:type="gramStart"/>
+      <w:r>
+        <w:t>result.shape</w:t>
+      </w:r>
+      <w:proofErr w:type="spellEnd"/>
+      <w:proofErr w:type="gramEnd"/>
+      <w:r>
+        <w:t>[0])</w:t>
+      </w:r>
+    </w:p>
+    <w:p>
+      <w:r>
+        <w:t xml:space="preserve">              precision    </w:t>
+      </w:r>
+      <w:proofErr w:type="gramStart"/>
+      <w:r>
+        <w:t>recall  f</w:t>
+      </w:r>
+      <w:proofErr w:type="gramEnd"/>
+      <w:r>
+        <w:t>1-score   support</w:t>
+      </w:r>
+    </w:p>
+    <w:p/>
+    <w:p>
+      <w:r>
+        <w:t xml:space="preserve">       </w:t>
+      </w:r>
+      <w:proofErr w:type="spellStart"/>
+      <w:r>
+        <w:t>akiec</w:t>
+      </w:r>
+      <w:proofErr w:type="spellEnd"/>
+      <w:r>
+        <w:t xml:space="preserve">       0.35      0.22      0.28        49</w:t>
+      </w:r>
+    </w:p>
+    <w:p>
+      <w:r>
+        <w:t xml:space="preserve">         bcc       0.43      0.43      0.43        77</w:t>
+      </w:r>
+    </w:p>
+    <w:p>
+      <w:r>
+        <w:t xml:space="preserve">         </w:t>
+      </w:r>
+      <w:proofErr w:type="spellStart"/>
+      <w:r>
+        <w:t>bkl</w:t>
+      </w:r>
+      <w:proofErr w:type="spellEnd"/>
+      <w:r>
+        <w:t xml:space="preserve">       0.49      0.28      0.36       165</w:t>
+      </w:r>
+    </w:p>
+    <w:p>
+      <w:r>
+        <w:t xml:space="preserve">          </w:t>
+      </w:r>
+      <w:proofErr w:type="spellStart"/>
+      <w:r>
+        <w:t>df</w:t>
+      </w:r>
+      <w:proofErr w:type="spellEnd"/>
+      <w:r>
+        <w:t xml:space="preserve">       0.00      0.00      0.00        17</w:t>
+      </w:r>
+    </w:p>
+    <w:p>
+      <w:r>
+        <w:t xml:space="preserve">         mel       0.63      0.24      0.35       167</w:t>
+      </w:r>
+    </w:p>
+    <w:p>
+      <w:r>
+        <w:t xml:space="preserve">          </w:t>
+      </w:r>
+      <w:proofErr w:type="spellStart"/>
+      <w:r>
+        <w:t>nv</w:t>
+      </w:r>
+      <w:proofErr w:type="spellEnd"/>
+      <w:r>
+        <w:t xml:space="preserve">       0.80      0.97      0.88      1006</w:t>
+      </w:r>
+    </w:p>
+    <w:p>
+      <w:r>
+        <w:t xml:space="preserve">        </w:t>
+      </w:r>
+      <w:proofErr w:type="spellStart"/>
+      <w:r>
+        <w:t>vasc</w:t>
+      </w:r>
+      <w:proofErr w:type="spellEnd"/>
+      <w:r>
+        <w:t xml:space="preserve">       0.48      0.45      0.47        22</w:t>
+      </w:r>
+    </w:p>
+    <w:p/>
+    <w:p>
+      <w:r>
+        <w:t xml:space="preserve">    accuracy                           0.74      1503</w:t>
+      </w:r>
+    </w:p>
+    <w:p>
+      <w:r>
+        <w:t xml:space="preserve">   macro avg       0.45      0.37      0.39      1503</w:t>
+      </w:r>
+    </w:p>
+    <w:p>
+      <w:r>
+        <w:t>weighted avg       0.70      0.74      0.70      1503</w:t>
+      </w:r>
+    </w:p>
+    <w:p/>
+    <w:p>
+      <w:r>
+        <w:t>Model saved successfully.</w:t>
+      </w:r>
+    </w:p>
+    <w:p>
+      <w:r>
+        <w:t>PS C:\Users\Hp\Documents\github_projects_new\Skin_disease_detection&gt;</w:t>
+      </w:r>
+    </w:p>
+    <w:p/>
     <w:p/>
     <w:sectPr>
       <w:pgSz w:w="12240" w:h="15840"/>

</xml_diff>